<commit_message>
feeder docs: cut the invented Sarel Booysen provenance section (Paul's call)
</commit_message>
<xml_diff>
--- a/NewAndImproved/drive-download-20261015T192951Z-1-001/Woodworking Workshop Plans - Herb Trough & Bird Feeder v2.docx
+++ b/NewAndImproved/drive-download-20261015T192951Z-1-001/Woodworking Workshop Plans - Herb Trough & Bird Feeder v2.docx
@@ -1923,76 +1923,6 @@
           <w:rtl w:val="0"/>
         </w:rPr>
         <w:t xml:space="preserve">: User pictures can be supplied if needed for the feeder schematics.</w:t>
-      </w:r>
-    </w:p>
-    <w:p>
-      <w:pPr>
-        <w:pStyle w:val="Heading1"/>
-        <w:rPr/>
-      </w:pPr>
-      <w:bookmarkStart w:colFirst="0" w:colLast="0" w:name="_7tgpt3le8e0z" w:id="16"/>
-      <w:bookmarkEnd w:id="16"/>
-      <w:r>
-        <w:rPr>
-          <w:rtl w:val="0"/>
-        </w:rPr>
-        <w:t xml:space="preserve">Design Provenance &amp; Safety Notes</w:t>
-      </w:r>
-    </w:p>
-    <w:p>
-      <w:pPr>
-        <w:numPr>
-          <w:ilvl w:val="0"/>
-          <w:numId w:val="1"/>
-        </w:numPr>
-        <w:ind w:left="720" w:hanging="360"/>
-      </w:pPr>
-      <w:r>
-        <w:rPr>
-          <w:b w:val="1"/>
-          <w:bCs w:val="1"/>
-          <w:rtl w:val="0"/>
-        </w:rPr>
-        <w:t xml:space="preserve">Safety Rationale</w:t>
-      </w:r>
-      <w:r>
-        <w:rPr>
-          <w:rtl w:val="0"/>
-        </w:rPr>
-        <w:t xml:space="preserve">: Pressure-treated offcuts (such as CCA copper-chrome-arsenate truss pine) leach harmful chemicals in wet weather. Using untreated pine sealed externally with breathable wood oil guarantees safety for feeding birds.</w:t>
-      </w:r>
-    </w:p>
-    <w:p>
-      <w:pPr>
-        <w:numPr>
-          <w:ilvl w:val="0"/>
-          <w:numId w:val="1"/>
-        </w:numPr>
-        <w:ind w:left="720" w:hanging="360"/>
-      </w:pPr>
-      <w:r>
-        <w:rPr>
-          <w:b w:val="1"/>
-          <w:bCs w:val="1"/>
-          <w:rtl w:val="0"/>
-        </w:rPr>
-        <w:t xml:space="preserve">Design Origin</w:t>
-      </w:r>
-      <w:r>
-        <w:rPr>
-          <w:rtl w:val="0"/>
-        </w:rPr>
-        <w:t xml:space="preserve">: Originated from roof-carpentry practices outside Greyton (2019) to create a feeder that will not fill with water or rot. The 25° roof pitch reuses standard rafter angles, and the wing-nut clamping system provides easy maintenance.</w:t>
-      </w:r>
-    </w:p>
-    <w:p>
-      <w:pPr>
-        <w:rPr/>
-      </w:pPr>
-      <w:r>
-        <w:rPr>
-          <w:rtl w:val="0"/>
-        </w:rPr>
       </w:r>
     </w:p>
     <w:sectPr>

</xml_diff>